<commit_message>
Apply red-team operability corrections
Adds the missing APRA front matter (A1-A6: authority, application,
commencement, transition for models already in use, adjustments and
exclusions, interpretation) without which the instrument had no lawful
route to vary a requirement and would have prohibited continued use of
existing models on commencement.

Nine further corrections: M04 no longer lets an entity except itself
from mandatory requirements; M21 no longer demands outcomes analysis
where no outcome is observable; M20 gains an urgent-business-need path;
M40 works for RSE licensees, which have no internal capital assessment;
M13, M31, M32 and M37 made achievable; M43 and M03 made testable; and
the guide's validation table states drivers rather than intervals.

Co-Authored-By: Claude Opus 5 <noreply@anthropic.com>
Claude-Session: https://claude.ai/code/session_01U9tVmgcRH2aPufRoj4ddoe
</commit_message>
<xml_diff>
--- a/CPG_XXXX_Model_Risk_Management.docx
+++ b/CPG_XXXX_Model_Risk_Management.docx
@@ -2579,7 +2579,7 @@
                 <w:rFonts w:ascii="Arial" w:hAnsi="Arial"/>
                 <w:sz w:val="16"/>
               </w:rPr>
-              <w:t>At least annually</w:t>
+              <w:t>Short cycle, and on any trigger event</w:t>
             </w:r>
           </w:p>
         </w:tc>
@@ -2597,7 +2597,7 @@
                 <w:rFonts w:ascii="Arial" w:hAnsi="Arial"/>
                 <w:sz w:val="16"/>
               </w:rPr>
-              <w:t>Every two to three years</w:t>
+              <w:t>Longer cycle, and on material trigger events</w:t>
             </w:r>
           </w:p>
         </w:tc>
@@ -2615,7 +2615,7 @@
                 <w:rFonts w:ascii="Arial" w:hAnsi="Arial"/>
                 <w:sz w:val="16"/>
               </w:rPr>
-              <w:t>Cyclical, risk-based</w:t>
+              <w:t>Extended cycle, and on material change</w:t>
             </w:r>
           </w:p>
         </w:tc>
@@ -2651,7 +2651,7 @@
                 <w:rFonts w:ascii="Arial" w:hAnsi="Arial"/>
                 <w:sz w:val="16"/>
               </w:rPr>
-              <w:t>Continuous or quarterly, with formal backtesting</w:t>
+              <w:t>Frequent, with formal backtesting where outcomes are observable</w:t>
             </w:r>
           </w:p>
         </w:tc>
@@ -2668,7 +2668,7 @@
                 <w:rFonts w:ascii="Arial" w:hAnsi="Arial"/>
                 <w:sz w:val="16"/>
               </w:rPr>
-              <w:t>Semi-annual or annual</w:t>
+              <w:t>Periodic; alternative evidence where outcomes are not observable</w:t>
             </w:r>
           </w:p>
         </w:tc>
@@ -2914,7 +2914,7 @@
         <w:pStyle w:val="Caption"/>
       </w:pPr>
       <w:r>
-        <w:t>Indicative validation intensity by tier. Frequencies are illustrative; entities should calibrate them and define the events that trigger validation outside the cycle.</w:t>
+        <w:t>Indicative validation intensity by tier. This table deliberately states the drivers rather than fixed intervals: no comparator authority prescribes validation frequencies on a cross-industry basis, and the OCC has confirmed that its guidance does not require annual validation. Entities should set their own cycle lengths and trigger events, and be able to justify them by tier.</w:t>
       </w:r>
     </w:p>
     <w:p>
@@ -2922,7 +2922,7 @@
         <w:pStyle w:val="Verification"/>
       </w:pPr>
       <w:r>
-        <w:t>⚠ Verification: the three core elements of validation are extracted from the US interagency guidance, which remains supervisory guidance rather than a regulation. Validation frequencies in the table above are illustrative drafting and are not taken from any comparator instrument; they are identified as a policy design choice in the assessment workbook.</w:t>
+        <w:t>⚠ Verification: the three components of validation are extracted from the current US interagency guidance, which is supervisory guidance rather than a regulation and is non-enforceable by its own terms. No fixed validation frequency is stated in this guide: the rescinded 2011 US guidance contained an at-least-annual periodic review expectation which the April 2026 guidance does not carry forward, and OCC Bulletin 2025-26 confirms that community banks are not required to validate annually. Setting cycle lengths is left to the entity, by tier.</w:t>
       </w:r>
     </w:p>
     <w:p>

</xml_diff>